<commit_message>
doc: adicao dos artefatos solicitados na fase 3
</commit_message>
<xml_diff>
--- a/docs/ApêndiceG-EntrevistasPotenciaisUsuários/Resultados.docx
+++ b/docs/ApêndiceG-EntrevistasPotenciaisUsuários/Resultados.docx
@@ -1670,7 +1670,7 @@
           <w:szCs w:val="24"/>
           <w:lang w:val="pt-BR"/>
         </w:rPr>
-        <w:t>A FIGURA 1 refere-se ao levantamento realizado para identificar os perfis de uso dos usuários no sistema Sage, parte integrante do projeto de final de curso intitulado “Desenvolvimento de um Sistema de Alerta e Gerenciamento de Emergências”. Com base em seis respostas coletadas por meio de formulário, observou-se que a maioria dos participantes (66,7%) se identificou com o perfil “Técnico”, enquanto os perfis “Administrador” e “Líder” foram apontados por apenas 16,7% dos respondentes cada. Esses dados refletem a composição esperada dos usuários finais do sistema, uma vez que o foco do projeto está voltado à rotina de atendimento da equipe de enfermagem em instituições de longa permanência, onde técnicos de enfermagem desempenham papel central no recebimento e atendimento de alertas. Essa predominância do perfil técnico reforça a necessidade de uma interface simples, direta e eficiente, alinhada às tarefas práticas e ao fluxo de trabalho desses profissionais.</w:t>
+        <w:t>A Figura 1 refere-se ao levantamento realizado para identificar os perfis de uso dos usuários no sistema Sage, parte integrante do projeto de final de curso intitulado “Desenvolvimento de um Sistema de Alerta e Gerenciamento de Emergências”. Com base em seis respostas coletadas por meio de formulário, observou-se que a maioria dos participantes (66,7%) se identificou com o perfil “Técnico”, enquanto os perfis “Administrador” e “Líder” foram apontados por apenas 16,7% dos respondentes cada. Esses dados refletem a composição esperada dos usuários finais do sistema, uma vez que o foco do projeto está voltado à rotina de atendimento da equipe de enfermagem em instituições de longa permanência, onde técnicos de enfermagem desempenham papel central no recebimento e atendimento de alertas. Essa predominância do perfil técnico reforça a necessidade de uma interface simples, direta e eficiente, alinhada às tarefas práticas e ao fluxo de trabalho desses profissionais.</w:t>
       </w:r>
     </w:p>
     <w:p>
@@ -1876,7 +1876,7 @@
           <w:szCs w:val="24"/>
           <w:lang w:val="pt-BR"/>
         </w:rPr>
-        <w:t>A FIGURA 2 demonstra que 100% dos participantes utilizam sistemas digitais diariamente. Esse resultado reforça que o público-alvo do sistema Sage está habituado ao uso contínuo de tecnologias digitais em sua rotina. Isso é especialmente relevante para o sucesso da implementação do sistema, pois indica que os profissionais de enfermagem e demais usuários já possuem uma cultura digital consolidada, o que facilita a aceitação da ferramenta e reduz a necessidade de treinamentos extensivos.</w:t>
+        <w:t>A Figura 2 demonstra que 100% dos participantes utilizam sistemas digitais diariamente. Esse resultado reforça que o público-alvo do sistema Sage está habituado ao uso contínuo de tecnologias digitais em sua rotina. Isso é especialmente relevante para o sucesso da implementação do sistema, pois indica que os profissionais de enfermagem e demais usuários já possuem uma cultura digital consolidada, o que facilita a aceitação da ferramenta e reduz a necessidade de treinamentos extensivos.</w:t>
       </w:r>
     </w:p>
     <w:p>
@@ -2098,7 +2098,7 @@
           <w:szCs w:val="24"/>
           <w:lang w:val="pt-BR"/>
         </w:rPr>
-        <w:t>A FIGURA 3 revela que todos os participantes atribuíram nota 5 — o valor máximo — para o nível de conforto no uso de sistemas digitais. Esse dado é extremamente positivo, pois confirma que os usuários se sentem totalmente confiantes em interagir com plataformas tecnológicas. No contexto do projeto Sage, essa informação valida a proposta de uma interface com maior autonomia operacional, garantindo que os usuários possam responder rapidamente às solicitações de emergência sem encontrar barreiras técnicas ou insegurança no uso do sistema.</w:t>
+        <w:t>A Figura 3 revela que todos os participantes atribuíram nota 5 — o valor máximo — para o nível de conforto no uso de sistemas digitais. Esse dado é extremamente positivo, pois confirma que os usuários se sentem totalmente confiantes em interagir com plataformas tecnológicas. No contexto do projeto Sage, essa informação valida a proposta de uma interface com maior autonomia operacional, garantindo que os usuários possam responder rapidamente às solicitações de emergência sem encontrar barreiras técnicas ou insegurança no uso do sistema.</w:t>
       </w:r>
     </w:p>
     <w:p>
@@ -2315,7 +2315,7 @@
           <w:szCs w:val="24"/>
           <w:lang w:val="pt-BR"/>
         </w:rPr>
-        <w:t>A FIGURA 4 indica que 100% dos participantes consideram importante receber notificações do sistema em tempo real. Este resultado corrobora diretamente com um dos objetivos principais do sistema Sage, que é garantir agilidade no atendimento de emergências em instituições de longa permanência. A total concordância entre os usuários evidencia que o componente de notificação deve ser tratado como funcionalidade essencial, reforçando a necessidade de uma comunicação eficiente e imediata entre os dispositivos e os profissionais de enfermagem.</w:t>
+        <w:t>A Figura 4 indica que 100% dos participantes consideram importante receber notificações do sistema em tempo real. Este resultado corrobora diretamente com um dos objetivos principais do sistema Sage, que é garantir agilidade no atendimento de emergências em instituições de longa permanência. A total concordância entre os usuários evidencia que o componente de notificação deve ser tratado como funcionalidade essencial, reforçando a necessidade de uma comunicação eficiente e imediata entre os dispositivos e os profissionais de enfermagem.</w:t>
       </w:r>
     </w:p>
     <w:p>
@@ -2521,7 +2521,7 @@
           <w:szCs w:val="24"/>
           <w:lang w:val="pt-BR"/>
         </w:rPr>
-        <w:t>A FIGURA 5 mostra uma divisão exata entre os participantes quanto ao tipo de interface preferida: metade prefere uma interface simples e direta, mesmo que com menos funcionalidades visíveis; a outra metade opta por uma interface completa, mesmo que com mais opções na tela. Esse resultado demonstra a diversidade de perfis de uso entre os usuários do sistema e destaca a importância de um design flexível e personalizável. Isso reforça a escolha de aplicar princípios de usabilidade e ergonomia no projeto da interface do sistema.</w:t>
+        <w:t>A Figura 5 mostra uma divisão exata entre os participantes quanto ao tipo de interface preferida: metade prefere uma interface simples e direta, mesmo que com menos funcionalidades visíveis; a outra metade opta por uma interface completa, mesmo que com mais opções na tela. Esse resultado demonstra a diversidade de perfis de uso entre os usuários do sistema e destaca a importância de um design flexível e personalizável. Isso reforça a escolha de aplicar princípios de usabilidade e ergonomia no projeto da interface do sistema.</w:t>
       </w:r>
     </w:p>
     <w:p>
@@ -2738,7 +2738,18 @@
           <w:szCs w:val="24"/>
           <w:lang w:val="pt-BR"/>
         </w:rPr>
-        <w:t>A FIGURA 6 revela que os participantes estão igualmente divididos entre três aspectos considerados críticos para a aceitação do sistema: facilidade de uso (usabilidade), confiabilidade das informações e tempo de resposta e performance, cada um com 33,3% das respostas. Esses dados indicam que a aceitação da solução depende de um equilíbrio entre a experiência do usuário, a segurança dos dados e a eficiência do sistema. Assim, o desenvolvimento do Sage deve priorizar esses três pilares para garantir a aderência dos profissionais ao uso contínuo da plataforma em ambientes de alta demanda assistencial.</w:t>
+        <w:t xml:space="preserve">A Figura </w:t>
+      </w:r>
+      <w:bookmarkStart w:id="12" w:name="_GoBack"/>
+      <w:bookmarkEnd w:id="12"/>
+      <w:r>
+        <w:rPr>
+          <w:rFonts w:hint="default" w:ascii="Times New Roman" w:hAnsi="Times New Roman" w:cs="Times New Roman"/>
+          <w:sz w:val="24"/>
+          <w:szCs w:val="24"/>
+          <w:lang w:val="pt-BR"/>
+        </w:rPr>
+        <w:t>6 revela que os participantes estão igualmente divididos entre três aspectos considerados críticos para a aceitação do sistema: facilidade de uso (usabilidade), confiabilidade das informações e tempo de resposta e performance, cada um com 33,3% das respostas. Esses dados indicam que a aceitação da solução depende de um equilíbrio entre a experiência do usuário, a segurança dos dados e a eficiência do sistema. Assim, o desenvolvimento do Sage deve priorizar esses três pilares para garantir a aderência dos profissionais ao uso contínuo da plataforma em ambientes de alta demanda assistencial.</w:t>
       </w:r>
     </w:p>
     <w:p>
@@ -2868,8 +2879,6 @@
         <w:t xml:space="preserve"> - Aceitação</w:t>
       </w:r>
       <w:bookmarkEnd w:id="11"/>
-      <w:bookmarkStart w:id="12" w:name="_GoBack"/>
-      <w:bookmarkEnd w:id="12"/>
     </w:p>
     <w:sectPr>
       <w:headerReference r:id="rId3" w:type="default"/>
@@ -2924,22 +2933,6 @@
                       <a:ln w="6350">
                         <a:noFill/>
                       </a:ln>
-                      <a:extLst>
-                        <a:ext uri="{909E8E84-426E-40DD-AFC4-6F175D3DCCD1}">
-                          <a14:hiddenFill xmlns:a14="http://schemas.microsoft.com/office/drawing/2010/main">
-                            <a:solidFill>
-                              <a:schemeClr val="lt1"/>
-                            </a:solidFill>
-                          </a14:hiddenFill>
-                        </a:ext>
-                        <a:ext uri="{91240B29-F687-4F45-9708-019B960494DF}">
-                          <a14:hiddenLine xmlns:a14="http://schemas.microsoft.com/office/drawing/2010/main" w="6350">
-                            <a:solidFill>
-                              <a:prstClr val="black"/>
-                            </a:solidFill>
-                          </a14:hiddenLine>
-                        </a:ext>
-                      </a:extLst>
                     </wps:spPr>
                     <wps:style>
                       <a:lnRef idx="0">
@@ -2990,7 +2983,7 @@
         </mc:Choice>
         <mc:Fallback>
           <w:pict>
-            <v:shape id="_x0000_s1026" o:spid="_x0000_s1026" o:spt="202" type="#_x0000_t202" style="position:absolute;left:0pt;margin-top:0pt;height:144pt;width:144pt;mso-position-horizontal:right;mso-position-horizontal-relative:margin;mso-wrap-style:none;z-index:251659264;mso-width-relative:page;mso-height-relative:page;" filled="f" stroked="f" coordsize="21600,21600" o:gfxdata="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">
+            <v:shape id="_x0000_s1026" o:spid="_x0000_s1026" o:spt="202" type="#_x0000_t202" style="position:absolute;left:0pt;margin-top:0pt;height:144pt;width:144pt;mso-position-horizontal:right;mso-position-horizontal-relative:margin;mso-wrap-style:none;z-index:251659264;mso-width-relative:page;mso-height-relative:page;" filled="f" stroked="f" coordsize="21600,21600" o:gfxdata="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">
               <v:fill on="f" focussize="0,0"/>
               <v:stroke on="f" weight="0.5pt"/>
               <v:imagedata o:title=""/>

</xml_diff>